<commit_message>
Corregir el conexionado del sensor y actualizar planillas y documentos de hardware
- Sensor de pasada: positivo -> R1 -> pata 1, pata 2 -> negro; el azul queda
  en el negativo del telar (diagramas, PNG y tres Word). Antes no se contaba
  ninguna pasada con un sensor NPN y se perdía el aislamiento.
- Guia_Armado_Bloque_A reescrita al diseño actual (HLK-5M05, 3 relés).
- Componentes_Completos y Árbol de docs/analisis al diseño de 4 LCA110.
- Planillas: capacitor 22-47 uF, oraciones repetidas, fechas, checklist
  con los pines del Nivel 2 y el reposo del módulo de 2 canales.
- Etiquetas de dos diagramas y CHECKLIST_VALIDACION corregidas.

Co-Authored-By: Claude Opus 5.5 <noreply@anthropic.com>
Claude-Session: https://claude.ai/code/session_01QiY8ZZNAM9gwPKiqSkCaaj
</commit_message>
<xml_diff>
--- a/docs/analisis/Arbol_de_problemas_y_soluciones.docx
+++ b/docs/analisis/Arbol_de_problemas_y_soluciones.docx
@@ -753,7 +753,7 @@
     </w:p>
     <w:p>
       <w:r>
-        <w:t>•  Dobby (por marcos): controla grupos de hilos, necesita solo 8 actuadores. Viable con un ESP32.</w:t>
+        <w:t xml:space="preserve">•  Dobby (por marcos): controla grupos de hilos, necesita solo las 4 bobinas de selección que el telar ya tiene. Viable con un ESP32.</w:t>
       </w:r>
     </w:p>
     <w:p>
@@ -774,7 +774,7 @@
     </w:p>
     <w:p>
       <w:r>
-        <w:t xml:space="preserve">En cada pasada del telar, algunos marcos suben y otros bajan; esa combinación forma el cruce de los hilos que da el dibujo. Con 8 marcos, cada pasada es simplemente cuáles de los 8 suben. El patrón repetitivo es una lista corta de esas combinaciones, que se repite en bucle. El backend le entrega esa secuencia al ESP32, y el ESP32 energiza en cada pasada los marcos que van arriba.</w:t>
+        <w:t xml:space="preserve">En cada pasada del telar, algunos marcos suben y otros bajan; esa combinación forma el cruce de los hilos que da el dibujo. Con las 4 bobinas de selección del telar, cada pasada es simplemente cuáles de las 4 se activan. El patrón repetitivo es una lista corta de esas combinaciones, que se repite en bucle. El backend le entrega esa secuencia al ESP32, y el ESP32 energiza en cada pasada los marcos que van arriba.</w:t>
       </w:r>
     </w:p>
     <w:p/>
@@ -790,7 +790,7 @@
     </w:p>
     <w:p>
       <w:r>
-        <w:t>•  8 actuadores, uno por marco: pueden ser electroimanes/solenoides que tiran de cada marco.</w:t>
+        <w:t xml:space="preserve">•  4 relés de estado sólido LCA110, uno por lector óptico: cortan la señal del lector en lugar del papel. Las bobinas de selección ya están instaladas y no se tocan.</w:t>
       </w:r>
     </w:p>
     <w:p>
@@ -800,12 +800,12 @@
     </w:p>
     <w:p>
       <w:r>
-        <w:t>•  Como son pocos, entran casi en los pines del ESP32; con un solo shift register (74HC595) sobra para manejar los 8.</w:t>
-      </w:r>
-    </w:p>
-    <w:p>
-      <w:r>
-        <w:t xml:space="preserve">•  Una fuente acorde al consumo de los actuadores.</w:t>
+        <w:t xml:space="preserve">•  Como son solo cuatro, van directo a cuatro pines del ESP32 (18, 19, 21 y 22): no hace falta un registro de desplazamiento.</w:t>
+      </w:r>
+    </w:p>
+    <w:p>
+      <w:r>
+        <w:t xml:space="preserve">•  No hace falta una fuente aparte: las bobinas siguen alimentadas por el telar con sus 24 V en alterna; el relé solo conmuta la señal del lector.</w:t>
       </w:r>
     </w:p>
     <w:p>
@@ -836,7 +836,7 @@
     </w:p>
     <w:p>
       <w:r>
-        <w:t>•  El firmware del ESP32 pasaría de accionar 3 relés (Marcha/Pausa/Retroceder) a accionar además los 8 actuadores de los marcos.</w:t>
+        <w:t xml:space="preserve">•  El firmware del ESP32 pasa de accionar 3 relés (Marcha/Pausa/Retroceder) a accionar además los 4 relés LCA110 de los lectores, en la misma placa.</w:t>
       </w:r>
     </w:p>
     <w:p>
@@ -862,7 +862,7 @@
     </w:p>
     <w:p>
       <w:r>
-        <w:t xml:space="preserve">•  Nivel 2 (alcanzable como prototipo): el ESP32 controla los marcos de un telar dobby según la secuencia que le manda el backend, tejiendo un patrón repetitivo real. Un demostrador de 8 marcos ya prueba el concepto completo, sin escalar a los cientos de hilos de un Jacquard.</w:t>
+        <w:t xml:space="preserve">•  Nivel 2 (alcanzable como prototipo): el ESP32 controla los marcos de un telar dobby según la secuencia que le manda el backend, tejiendo un patrón repetitivo real. Las 4 bobinas del C 201 ya prueban el concepto completo, sin escalar a los cientos de hilos de un Jacquard.</w:t>
       </w:r>
     </w:p>
     <w:p/>

</xml_diff>

<commit_message>
Décima revisión: web, firmware y documentación completa
- Web: ▶ no anima si el telar no quedó en marcha y no arranca dos veces; el
  registro de errores no se inunda (un envío por tipo cada 30 s); la ficha
  se recarga al cambiar de dibujo; el origen de la sesión sobrevive a
  recargar; avisos del invitado una sola vez; esc() y colores de fila
  endurecidos.
- Firmware: sin selección en el pulso de retroceso; FijarTotal limpia la
  reclasificación pendiente (con test en la PC).
- Documentación: manuales de instalación y de la web, guía de la base,
  despliegue, READMEs, documentos eléctricos, árbol de problemas (Word y
  Markdown) y la referencia Android, al día con el código.

Co-Authored-By: Claude Opus 5.5 <noreply@anthropic.com>
Claude-Session: https://claude.ai/code/session_01QiY8ZZNAM9gwPKiqSkCaaj
</commit_message>
<xml_diff>
--- a/docs/analisis/Arbol_de_problemas_y_soluciones.docx
+++ b/docs/analisis/Arbol_de_problemas_y_soluciones.docx
@@ -202,7 +202,7 @@
         </w:numPr>
       </w:pPr>
       <w:r>
-        <w:t>Se diseñó una base de datos central (PostgreSQL en Neon) con 4 Tablas: patrones, telares, historial y errores. → ataca las causas 2 y 5.</w:t>
+        <w:t>Se diseñó una base de datos central (PostgreSQL en Neon) con 4 Tablas: patrones, telares, historial y errores (después se sumaron las del ingreso de usuarios). → ataca las causas 2 y 5.</w:t>
       </w:r>
     </w:p>
     <w:p>
@@ -238,7 +238,7 @@
         </w:numPr>
       </w:pPr>
       <w:r>
-        <w:t xml:space="preserve">Se desarrolló el firmware del ESP32 que conecta el telar físico al Sistema, accionando los relés de Marcha/Pausa según lo que indica el backend. → ataca la causa 3.</w:t>
+        <w:t xml:space="preserve">Se desarrolló el firmware del ESP32 que conecta el telar físico al Sistema, accionando los relés de Marcha, Pausa y Retroceder según lo que indica el backend. → ataca la causa 3.</w:t>
       </w:r>
     </w:p>
     <w:p>
@@ -387,7 +387,7 @@
         </w:numPr>
       </w:pPr>
       <w:r>
-        <w:t xml:space="preserve">Cuarto problema — “esto sigue siendo software; el telar real no está conectado”. → Solución: se diseñó el ESP32 como gateway, que consulta el estado al backend y acciona los botones de Marcha/Pausa del telar mediante relés en paralelo, sin invadir la electrónica de la máquina y con comportamiento seguro ante fallas (fail-safe).</w:t>
+        <w:t xml:space="preserve">Cuarto problema — “esto sigue siendo software; el telar real no está conectado”. → Solución: se diseñó el ESP32 como gateway, que consulta el estado al backend y acciona los botones de Marcha, Pausa y Retroceder del telar mediante relés en paralelo, sin invadir la electrónica de la máquina y con comportamiento seguro ante fallas (fail-safe).</w:t>
       </w:r>
     </w:p>
     <w:p/>

</xml_diff>

<commit_message>
Actualización al 28/10/2026: prueba completa del Nivel 2 y plaqueta del ESP32
- Gantt (desde la planilla de Drive), diagrama y PNG al 28/10.
- Registro de entrevistas: reunión del 28/10 con los dos videos.
- Bitácora: entradas del 22, 25, 26, 27 y 28/10.
- Plaqueta del ESP32 (PCB en PNG, SVG y DXF) y diagrama de plaquetas con
  los puentes de alambre.
- Lista de componentes, componentes en placa y checklist con lo usado de
  verdad.
- Estimación de costos y modalidad de contrato recalculadas, con el
  diagrama nuevo.
- Guías de conexión y puesta en marcha, mediciones y conexiones de las
  plaquetas con la plaqueta del ESP32 y lo medido el 28/10.
- Documentación de Proyecto (versión 5.2), estado completo, manual del
  telar, Nivel 2, árbol de problemas y Markdown al día.
- PDF regenerados. El firmware queda sin cambios.

Co-Authored-By: Claude Opus 5.5 <noreply@anthropic.com>
Claude-Session: https://claude.ai/code/session_01QiY8ZZNAM9gwPKiqSkCaaj
</commit_message>
<xml_diff>
--- a/docs/analisis/Arbol_de_problemas_y_soluciones.docx
+++ b/docs/analisis/Arbol_de_problemas_y_soluciones.docx
@@ -704,7 +704,7 @@
         <w:rPr>
           <w:b/>
         </w:rPr>
-        <w:t xml:space="preserve">Nivel 2 — Dictar la secuencia del patrón (en desarrollo)</w:t>
+        <w:t xml:space="preserve">Nivel 2 — Dictar la secuencia del patrón (instalado y probado)</w:t>
       </w:r>
     </w:p>
     <w:p>
@@ -714,7 +714,7 @@
     </w:p>
     <w:p>
       <w:r>
-        <w:t xml:space="preserve">•  Estado: en desarrollo. El sensor de pasada y el relé de selección se probaron en protoboard el 10/10/2026, y el 17/10/2026 en la máquina, todavía en protoboard: el sensor cuenta las pasadas y el primer canal seleccionó bien. Las plaquetas para instalar los cuatro canales ya están soldadas (20/10/2026).</w:t>
+        <w:t xml:space="preserve">•  Estado: instalado y probado en el telar el 28/10/2026, con el gabinete y los cuatro canales: el sensor cuenta las pasadas y cada relé LCA110 selecciona su bobina según el dibujo cargado en la aplicación. Antes se había probado en protoboard (10/10/2026) y con el primer canal en la máquina (17/10/2026).</w:t>
       </w:r>
     </w:p>
     <w:p>
@@ -748,7 +748,7 @@
     </w:p>
     <w:p>
       <w:r>
-        <w:t xml:space="preserve">•  En desarrollo (Nivel 2): que el ESP32 le dicte la secuencia completa al telar, reemplazando a la cinta perforada, con un relé LCA110 en el lugar de cada lector óptico.</w:t>
+        <w:t xml:space="preserve">•  Instalado y probado el 28/10/2026 (Nivel 2): que el ESP32 le dicte la secuencia completa al telar, reemplazando a la cinta perforada, con un relé LCA110 en el lugar de cada lector óptico.</w:t>
       </w:r>
     </w:p>
     <w:p/>

</xml_diff>

<commit_message>
La prueba con las plaquetas fue el 30/10 y el precio final por telar
- 28/10 → 30/10 en READMEs, guías, Word, planillas y sus PDF (la prueba del
  proyecto completo, la reunión 8 y la entrada de la Bitácora).
- Gantt bajado de Drive con las tareas 7.7 a 7.11 y 8.17 desde el 30/10.
- Estimación de Costos: costos varios de $77.050 (insumos y dos meses de
  Claude Pro), inversión de $32.021.188 y precio final de $3.200.000 por
  telar, que la recupera con 19 telares en dos años.
- Modalidad, Documentación de Proyecto, Bitácora y el diagrama de costos
  con el precio por telar.

Co-Authored-By: Claude Opus 5.5 <noreply@anthropic.com>
Claude-Session: https://claude.ai/code/session_01QiY8ZZNAM9gwPKiqSkCaaj
</commit_message>
<xml_diff>
--- a/docs/analisis/Arbol_de_problemas_y_soluciones.docx
+++ b/docs/analisis/Arbol_de_problemas_y_soluciones.docx
@@ -714,7 +714,7 @@
     </w:p>
     <w:p>
       <w:r>
-        <w:t xml:space="preserve">•  Estado: instalado y probado en el telar el 28/10/2026, con el gabinete y los cuatro canales: el sensor cuenta las pasadas y cada relé LCA110 selecciona su bobina según el dibujo cargado en la aplicación. Antes se había probado en protoboard (10/10/2026) y con el primer canal en la máquina (17/10/2026).</w:t>
+        <w:t xml:space="preserve">•  Estado: instalado y probado en el telar el 30/10/2026, con el gabinete y los cuatro canales: el sensor cuenta las pasadas y cada relé LCA110 selecciona su bobina según el dibujo cargado en la aplicación. Antes se había probado en protoboard (10/10/2026) y con el primer canal en la máquina (17/10/2026).</w:t>
       </w:r>
     </w:p>
     <w:p>
@@ -748,7 +748,7 @@
     </w:p>
     <w:p>
       <w:r>
-        <w:t xml:space="preserve">•  Instalado y probado el 28/10/2026 (Nivel 2): que el ESP32 le dicte la secuencia completa al telar, reemplazando a la cinta perforada, con un relé LCA110 en el lugar de cada lector óptico.</w:t>
+        <w:t xml:space="preserve">•  Instalado y probado el 30/10/2026 (Nivel 2): que el ESP32 le dicte la secuencia completa al telar, reemplazando a la cinta perforada, con un relé LCA110 en el lugar de cada lector óptico.</w:t>
       </w:r>
     </w:p>
     <w:p/>

</xml_diff>